<commit_message>
Fix template: remove stacked section breaks, use table row pageBreakBefore for Page 2
</commit_message>
<xml_diff>
--- a/storage/templates/Thesis_Certification_Template.docx
+++ b/storage/templates/Thesis_Certification_Template.docx
@@ -2291,12 +2291,6 @@
         <w:rPr>
           <w:lang w:val="en-US"/>
         </w:rPr>
-        <w:sectPr>
-          <w:pgSz w:w="11906" w:h="16838" w:code="9"/>
-          <w:pgMar w:top="1843" w:right="1418" w:bottom="1418" w:left="2268" w:header="709" w:footer="709" w:gutter="0"/>
-          <w:cols w:space="708"/>
-          <w:docGrid w:linePitch="360"/>
-        </w:sectPr>
       </w:pPr>
     </w:p>
     <w:p>
@@ -2316,12 +2310,6 @@
           <w:szCs w:val="22"/>
           <w:lang w:val="en-US"/>
         </w:rPr>
-        <w:sectPr>
-          <w:pgSz w:w="11906" w:h="16838" w:code="9"/>
-          <w:pgMar w:top="1843" w:right="1418" w:bottom="1418" w:left="2268" w:header="709" w:footer="709" w:gutter="0"/>
-          <w:cols w:space="708"/>
-          <w:docGrid w:linePitch="360"/>
-        </w:sectPr>
       </w:pPr>
     </w:p>
     <w:tbl>
@@ -2339,6 +2327,9 @@
       </w:tblGrid>
       <w:tr>
         <w:trPr>
+          <w:pageBreakBefore/>
+        </w:trPr>
+        <w:trPr>
           <w:trHeight w:val="350"/>
         </w:trPr>
         <w:tc>
@@ -3427,12 +3418,6 @@
         <w:rPr>
           <w:lang w:val="en-US"/>
         </w:rPr>
-        <w:sectPr>
-          <w:pgSz w:w="11906" w:h="16838" w:code="9"/>
-          <w:pgMar w:top="1843" w:right="1418" w:bottom="1418" w:left="2268" w:header="709" w:footer="709" w:gutter="0"/>
-          <w:cols w:space="708"/>
-          <w:docGrid w:linePitch="360"/>
-        </w:sectPr>
       </w:pPr>
     </w:p>
     <w:p>

</xml_diff>